<commit_message>
Compress PJ Offner's delivery schedule from 11 weeks to 8
Concepts 3 to 2 weeks, refinement 2 to 1, identity and packaging artwork 4 to 3.
The brand book stays at 2 weeks: it is the deliverable a licensee buys in year 4,
so the compression comes out of the earlier stages rather than the asset.

Updated in the term sheet (markdown and Word), the creative brief and the
one-pager. No model impact — setup costs are month-based and the month-4
deadline for production artwork with the supplier now has more slack, not less.

Co-Authored-By: Claude Opus 5 <noreply@anthropic.com>
Claude-Session: https://claude.ai/code/session_01CyUnGEUeLA6NDJVnh9isax
</commit_message>
<xml_diff>
--- a/legal/term-sheet-pj-offner.docx
+++ b/legal/term-sheet-pj-offner.docx
@@ -1240,7 +1240,7 @@
                 <w:sz w:val="19"/>
                 <w:szCs w:val="19"/>
               </w:rPr>
-              <w:t xml:space="preserve">3 weeks</w:t>
+              <w:t xml:space="preserve">2 weeks</w:t>
             </w:r>
           </w:p>
         </w:tc>
@@ -1301,7 +1301,7 @@
                 <w:sz w:val="19"/>
                 <w:szCs w:val="19"/>
               </w:rPr>
-              <w:t xml:space="preserve">2 weeks</w:t>
+              <w:t xml:space="preserve">1 week</w:t>
             </w:r>
           </w:p>
         </w:tc>
@@ -1360,7 +1360,7 @@
                 <w:sz w:val="19"/>
                 <w:szCs w:val="19"/>
               </w:rPr>
-              <w:t xml:space="preserve">4 weeks</w:t>
+              <w:t xml:space="preserve">3 weeks</w:t>
             </w:r>
           </w:p>
         </w:tc>
@@ -1480,7 +1480,7 @@
                 <w:sz w:val="19"/>
                 <w:szCs w:val="19"/>
               </w:rPr>
-              <w:t xml:space="preserve">~11 weeks</w:t>
+              <w:t xml:space="preserve">8 weeks</w:t>
             </w:r>
           </w:p>
         </w:tc>

</xml_diff>